<commit_message>
Fixed Heding in test cases
</commit_message>
<xml_diff>
--- a/Assignment2/GoogleMaps/Bug_Report_GoogleMaps.docx
+++ b/Assignment2/GoogleMaps/Bug_Report_GoogleMaps.docx
@@ -382,13 +382,47 @@
             <w:vAlign w:val="center"/>
           </w:tcPr>
           <w:p>
+            <w:pPr>
+              <w:rPr>
+                <w:rFonts w:hint="default"/>
+                <w:lang w:val="en-US"/>
+              </w:rPr>
+            </w:pPr>
             <w:r>
               <w:rPr>
                 <w:rFonts w:ascii="Calibri" w:hAnsi="Calibri" w:eastAsia="Calibri" w:cs="Calibri"/>
                 <w:sz w:val="20"/>
                 <w:szCs w:val="20"/>
               </w:rPr>
-              <w:t>Android OS</w:t>
+              <w:t xml:space="preserve">Android </w:t>
+            </w:r>
+            <w:r>
+              <w:rPr>
+                <w:rFonts w:hint="default" w:cs="Calibri"/>
+                <w:sz w:val="20"/>
+                <w:szCs w:val="20"/>
+                <w:lang w:val="en-US"/>
+              </w:rPr>
+              <w:t xml:space="preserve">16 </w:t>
+            </w:r>
+            <w:bookmarkStart w:id="0" w:name="_GoBack"/>
+            <w:bookmarkEnd w:id="0"/>
+            <w:r>
+              <w:rPr>
+                <w:rFonts w:ascii="Calibri" w:hAnsi="Calibri" w:eastAsia="Calibri" w:cs="Calibri"/>
+                <w:sz w:val="20"/>
+                <w:szCs w:val="20"/>
+              </w:rPr>
+              <w:t>OS</w:t>
+            </w:r>
+            <w:r>
+              <w:rPr>
+                <w:rFonts w:hint="default" w:cs="Calibri"/>
+                <w:sz w:val="20"/>
+                <w:szCs w:val="20"/>
+                <w:lang w:val="en-US"/>
+              </w:rPr>
+              <w:t>, Samsung S23, Google Maps 26.21</w:t>
             </w:r>
           </w:p>
         </w:tc>
@@ -3415,8 +3449,6 @@
           <w:lang w:val="en-US"/>
         </w:rPr>
       </w:pPr>
-      <w:bookmarkStart w:id="0" w:name="_GoBack"/>
-      <w:bookmarkEnd w:id="0"/>
     </w:p>
     <w:sectPr>
       <w:headerReference r:id="rId3" w:type="default"/>
@@ -3545,7 +3577,7 @@
     <w:lsdException w:unhideWhenUsed="0" w:uiPriority="0" w:semiHidden="0" w:name="Document Map"/>
     <w:lsdException w:unhideWhenUsed="0" w:uiPriority="0" w:semiHidden="0" w:name="Plain Text"/>
     <w:lsdException w:unhideWhenUsed="0" w:uiPriority="0" w:semiHidden="0" w:name="E-mail Signature"/>
-    <w:lsdException w:unhideWhenUsed="0" w:uiPriority="0" w:semiHidden="0" w:name="Normal (Web)"/>
+    <w:lsdException w:qFormat="1" w:unhideWhenUsed="0" w:uiPriority="0" w:semiHidden="0" w:name="Normal (Web)"/>
     <w:lsdException w:unhideWhenUsed="0" w:uiPriority="0" w:semiHidden="0" w:name="HTML Acronym"/>
     <w:lsdException w:unhideWhenUsed="0" w:uiPriority="0" w:semiHidden="0" w:name="HTML Address"/>
     <w:lsdException w:unhideWhenUsed="0" w:uiPriority="0" w:semiHidden="0" w:name="HTML Cite"/>
@@ -3767,6 +3799,7 @@
   </w:style>
   <w:style w:type="paragraph" w:styleId="7">
     <w:name w:val="Normal (Web)"/>
+    <w:qFormat/>
     <w:uiPriority w:val="0"/>
     <w:pPr>
       <w:spacing w:before="0" w:beforeAutospacing="1" w:after="0" w:afterAutospacing="1"/>

</xml_diff>